<commit_message>
docs(report): refine VKU report cover page layout to fit single page cleanly
</commit_message>
<xml_diff>
--- a/docs/BaoCao.docx
+++ b/docs/BaoCao.docx
@@ -4,6 +4,7 @@
   <w:body>
     <w:p>
       <w:pPr>
+        <w:spacing w:after="160"/>
         <w:jc w:val="center"/>
       </w:pPr>
       <w:r>
@@ -11,7 +12,7 @@
           <w:rFonts w:ascii="Times New Roman" w:hAnsi="Times New Roman"/>
           <w:b/>
           <w:color w:val="1E3A8A"/>
-          <w:sz w:val="26"/>
+          <w:sz w:val="25"/>
         </w:rPr>
         <w:t>ĐẠI HỌC ĐÀ NẴNG</w:t>
         <w:br/>
@@ -24,11 +25,7 @@
     </w:p>
     <w:p>
       <w:pPr>
-        <w:spacing w:after="480"/>
-      </w:pPr>
-    </w:p>
-    <w:p>
-      <w:pPr>
+        <w:spacing w:before="120" w:after="120"/>
         <w:jc w:val="center"/>
       </w:pPr>
       <w:r>
@@ -36,7 +33,7 @@
           <w:rFonts w:ascii="Times New Roman" w:hAnsi="Times New Roman"/>
           <w:b/>
           <w:color w:val="0F172A"/>
-          <w:sz w:val="32"/>
+          <w:sz w:val="31"/>
         </w:rPr>
         <w:t>BÁO CÁO ĐỒ ÁN HỌC PHẦN</w:t>
         <w:br/>
@@ -45,11 +42,7 @@
     </w:p>
     <w:p>
       <w:pPr>
-        <w:spacing w:after="240"/>
-      </w:pPr>
-    </w:p>
-    <w:p>
-      <w:pPr>
+        <w:spacing w:after="80"/>
         <w:jc w:val="center"/>
       </w:pPr>
       <w:r>
@@ -57,7 +50,7 @@
           <w:rFonts w:ascii="Times New Roman" w:hAnsi="Times New Roman"/>
           <w:b/>
           <w:color w:val="B45309"/>
-          <w:sz w:val="30"/>
+          <w:sz w:val="28"/>
         </w:rPr>
         <w:t>ĐỀ TÀI 17:</w:t>
         <w:br/>
@@ -75,7 +68,7 @@
       <w:r>
         <w:drawing>
           <wp:inline xmlns:a="http://schemas.openxmlformats.org/drawingml/2006/main" xmlns:pic="http://schemas.openxmlformats.org/drawingml/2006/picture">
-            <wp:extent cx="2834640" cy="2635664"/>
+            <wp:extent cx="2148840" cy="1998003"/>
             <wp:docPr id="1" name="Picture 1"/>
             <wp:cNvGraphicFramePr>
               <a:graphicFrameLocks noChangeAspect="1"/>
@@ -96,7 +89,7 @@
                   <pic:spPr>
                     <a:xfrm>
                       <a:off x="0" y="0"/>
-                      <a:ext cx="2834640" cy="2635664"/>
+                      <a:ext cx="2148840" cy="1998003"/>
                     </a:xfrm>
                     <a:prstGeom prst="rect"/>
                   </pic:spPr>
@@ -137,7 +130,7 @@
       <w:tr>
         <w:tc>
           <w:tcPr>
-            <w:tcW w:type="dxa" w:w="3118"/>
+            <w:tcW w:type="dxa" w:w="2948"/>
             <w:shd w:fill="1E3A8A"/>
             <w:tcMar>
               <w:top w:w="100" w:type="dxa"/>
@@ -164,7 +157,7 @@
         </w:tc>
         <w:tc>
           <w:tcPr>
-            <w:tcW w:type="dxa" w:w="5953"/>
+            <w:tcW w:type="dxa" w:w="6123"/>
             <w:shd w:fill="1E3A8A"/>
             <w:tcMar>
               <w:top w:w="100" w:type="dxa"/>
@@ -193,7 +186,7 @@
       <w:tr>
         <w:tc>
           <w:tcPr>
-            <w:tcW w:type="dxa" w:w="3118"/>
+            <w:tcW w:type="dxa" w:w="2948"/>
             <w:shd w:fill="FFFFFF"/>
             <w:tcMar>
               <w:top w:w="80" w:type="dxa"/>
@@ -219,7 +212,7 @@
         </w:tc>
         <w:tc>
           <w:tcPr>
-            <w:tcW w:type="dxa" w:w="5953"/>
+            <w:tcW w:type="dxa" w:w="6123"/>
             <w:shd w:fill="FFFFFF"/>
             <w:tcMar>
               <w:top w:w="80" w:type="dxa"/>
@@ -247,7 +240,7 @@
       <w:tr>
         <w:tc>
           <w:tcPr>
-            <w:tcW w:type="dxa" w:w="3118"/>
+            <w:tcW w:type="dxa" w:w="2948"/>
             <w:shd w:fill="F8FAFC"/>
             <w:tcMar>
               <w:top w:w="80" w:type="dxa"/>
@@ -273,7 +266,7 @@
         </w:tc>
         <w:tc>
           <w:tcPr>
-            <w:tcW w:type="dxa" w:w="5953"/>
+            <w:tcW w:type="dxa" w:w="6123"/>
             <w:shd w:fill="F8FAFC"/>
             <w:tcMar>
               <w:top w:w="80" w:type="dxa"/>
@@ -301,7 +294,7 @@
       <w:tr>
         <w:tc>
           <w:tcPr>
-            <w:tcW w:type="dxa" w:w="3118"/>
+            <w:tcW w:type="dxa" w:w="2948"/>
             <w:shd w:fill="FFFFFF"/>
             <w:tcMar>
               <w:top w:w="80" w:type="dxa"/>
@@ -327,7 +320,7 @@
         </w:tc>
         <w:tc>
           <w:tcPr>
-            <w:tcW w:type="dxa" w:w="5953"/>
+            <w:tcW w:type="dxa" w:w="6123"/>
             <w:shd w:fill="FFFFFF"/>
             <w:tcMar>
               <w:top w:w="80" w:type="dxa"/>
@@ -355,7 +348,7 @@
       <w:tr>
         <w:tc>
           <w:tcPr>
-            <w:tcW w:type="dxa" w:w="3118"/>
+            <w:tcW w:type="dxa" w:w="2948"/>
             <w:shd w:fill="F8FAFC"/>
             <w:tcMar>
               <w:top w:w="80" w:type="dxa"/>
@@ -381,7 +374,7 @@
         </w:tc>
         <w:tc>
           <w:tcPr>
-            <w:tcW w:type="dxa" w:w="5953"/>
+            <w:tcW w:type="dxa" w:w="6123"/>
             <w:shd w:fill="F8FAFC"/>
             <w:tcMar>
               <w:top w:w="80" w:type="dxa"/>
@@ -409,7 +402,7 @@
       <w:tr>
         <w:tc>
           <w:tcPr>
-            <w:tcW w:type="dxa" w:w="3118"/>
+            <w:tcW w:type="dxa" w:w="2948"/>
             <w:shd w:fill="FFFFFF"/>
             <w:tcMar>
               <w:top w:w="80" w:type="dxa"/>
@@ -435,7 +428,7 @@
         </w:tc>
         <w:tc>
           <w:tcPr>
-            <w:tcW w:type="dxa" w:w="5953"/>
+            <w:tcW w:type="dxa" w:w="6123"/>
             <w:shd w:fill="FFFFFF"/>
             <w:tcMar>
               <w:top w:w="80" w:type="dxa"/>
@@ -468,7 +461,7 @@
     </w:p>
     <w:p>
       <w:pPr>
-        <w:spacing w:before="360"/>
+        <w:spacing w:before="160" w:after="0"/>
         <w:jc w:val="center"/>
       </w:pPr>
       <w:r>

</xml_diff>